<commit_message>
2Thessalonians audit: 8 gates pass, 9 text fixes (1:1-2 subject, 2:3-5 take over/quote, 2:9-12, 3:8), completeness checker verseRanges fallback fix, docs reuploaded
</commit_message>
<xml_diff>
--- a/gdocs_build/2Thessalonians.docx
+++ b/gdocs_build/2Thessalonians.docx
@@ -124,7 +124,7 @@
               <w:rPr>
                 <w:sz w:val="18"/>
               </w:rPr>
-              <w:t>What's up, guys? It's Paul, Silas, and Timothy here, giving a shout-out to our crew in Thessalonica. We're repping God the Father and our main man, Jesus Christ. He's the one who hooks you up with everything you need and helps you grow into who you're meant to be.</w:t>
+              <w:t>What's up, guys? It's Paul, Silas, and Timothy here, giving a shout-out to our crew in Thessalonica. We're repping God the Father and our main man, Jesus Christ. The Father's the one who hooks you up with everything you need and helps you grow into who you're meant to be.</w:t>
             </w:r>
           </w:p>
         </w:tc>
@@ -147,7 +147,7 @@
               <w:rPr>
                 <w:sz w:val="18"/>
               </w:rPr>
-              <w:t>다들 잘 지내? 나 바울이야, 실루아노랑 디모데랑 같이 데살로니가에 있는 우리 식구들한테 인사해. 우리는 하나님 아버지랑 우리의 주 예수 그리스도를 따르는 사람들이야. 그분이 너희에게 필요한 모든 걸 주시고, 너희가 되어야 할 모습으로 자라게 해 주셔.</w:t>
+              <w:t>다들 잘 지내? 나 바울이야, 실루아노랑 디모데랑 같이 데살로니가에 있는 우리 식구들한테 인사해. 우리는 하나님 아버지랑 우리의 주 예수 그리스도를 따르는 사람들이야. 하나님 아버지가 너희에게 필요한 모든 걸 주시고, 너희가 되어야 할 모습으로 자라게 해 주셔.</w:t>
             </w:r>
           </w:p>
         </w:tc>
@@ -672,7 +672,7 @@
               <w:rPr>
                 <w:sz w:val="18"/>
               </w:rPr>
-              <w:t>Before the real deal goes down, a couple of things have to happen first. First, a bunch of people are gonna totally ghost God — a massive falling away. Then, the ultimate enemy shows up, this guy who's basically Satan's right-hand man. He's gonna go on a rampage, dissing every other god and trashing their temples. Once he's cleared the field, he's gonna walk into God's own Temple, sit on the throne, and be like, "I'm God now." Seriously, don't you remember me going over all this in detail when I was with you? Are your memories that short?</w:t>
+              <w:t>Before the real deal goes down, a couple of things have to happen first. First, a bunch of people are gonna totally ghost God — a massive falling away. Then, the ultimate enemy shows up, this guy who's basically Satan's right-hand man. He's gonna go on a rampage, defying every so-called god and taking over their altars. Once he's cleared the field, he's gonna walk into God's own Temple and set himself up, declaring, "I am God Almighty." Seriously, don't you remember me going over all this in detail when I was with you? Are your memories that short?</w:t>
             </w:r>
           </w:p>
         </w:tc>
@@ -695,7 +695,7 @@
               <w:rPr>
                 <w:sz w:val="18"/>
               </w:rPr>
-              <w:t>진짜가 오기 전에 몇 가지가 먼저 일어나야 해. 첫째, 엄청난 배교 — 사람들이 무더기로 하나님을 떠날 거야. 그다음, 최종 보스가 등장해. 이 녀석은 사탄의 오른팔 같은 존재야. 온갖 신들을 대적하고 신전들을 다 뒤집어엎는 난리를 칠 거야. 싹 정리하고 나면 하나님의 성전으로 걸어 들어가 왕좌에 앉아서 '이제 내가 하나님이야'라고 할 거야. 진짜로, 내가 너희랑 있을 때 이걸 다 자세히 말해줬던 거 벌써 까먹었어? 기억력 뭐야?</w:t>
+              <w:t>진짜가 오기 전에 몇 가지가 먼저 일어나야 해. 첫째, 엄청난 배교 — 사람들이 무더기로 하나님을 떠날 거야. 그다음, 최종 보스가 등장해. 이 녀석은 사탄의 오른팔 같은 존재야. 소위 신이라는 것들을 모조리 대적하고 제단을 차지하는 난리를 칠 거야. 싹 정리하고 나면 하나님의 성전으로 걸어 들어가 '내가 전능하신 하나님이야'라고 선언할 거야. 진짜로, 내가 너희랑 있을 때 이걸 다 자세히 말해줬던 거 벌써 까먹었어? 기억력 뭐야?</w:t>
             </w:r>
           </w:p>
         </w:tc>
@@ -814,7 +814,7 @@
               <w:rPr>
                 <w:sz w:val="18"/>
               </w:rPr>
-              <w:t>The Anarchist's big entrance is all Satan's work. He'll roll in with fake power, pulling off bogus signs and miracles — evil sleight of hand, a scam to trick people who hate the truth that could save them. And since they're so obsessed with evil, God gives them exactly what they want. They refuse to trust the truth, so they're banished to their chosen world of lies and illusions.</w:t>
+              <w:t>The Anarchist's big entrance is all Satan's work. He'll roll in with fake power, pulling off bogus signs and miracles — evil sleight of hand, a scam to trick people who hate the truth that could save them. And since they're so obsessed with evil, God rubs their noses in it — gives them exactly what they want. They refuse to trust the truth, so they're banished to their chosen world of lies and illusions.</w:t>
             </w:r>
           </w:p>
         </w:tc>
@@ -837,7 +837,7 @@
               <w:rPr>
                 <w:sz w:val="18"/>
               </w:rPr>
-              <w:t>무법자의 등장은 전부 사탄의 작품이야. 가짜 능력으로 사기 기적과 표징을 잔뜩 부릴 거야. 사람을 구할 수 있는 진리를 미워하는 사람들을 속이는, 사악한 마술 같은 사기극이지. 그들이 악에 푹 빠져 있으니까, 하나님은 그들이 원하는 걸 그대로 주셔. 진리를 믿기 거부하니까, 그들이 선택한 거짓과 환상의 세계로 추방되는 거야.</w:t>
+              <w:t>무법자의 등장은 전부 사탄의 작품이야. 가짜 능력으로 사기 기적과 표징을 잔뜩 부릴 거야. 사람을 구할 수 있는 진리를 미워하는 사람들을 속이는, 사악한 마술 같은 사기극이지. 그들이 악에 푹 빠져 있으니까, 하나님은 그 악을 그들 코앞에 들이밀어 주셔 — 그들이 원하는 걸 그대로 주시는 거야. 진리를 믿기 거부하니까, 그들이 선택한 거짓과 환상의 세계로 추방되는 거야.</w:t>
             </w:r>
           </w:p>
         </w:tc>
@@ -1299,7 +1299,7 @@
               <w:rPr>
                 <w:sz w:val="18"/>
               </w:rPr>
-              <w:t>Now, here's a direct order from our Lord, Jesus Christ: keep your distance from anyone in the squad who's being lazy and won't work the way we taught you. Don't let them freeload off everyone else. We showed you how to pull your weight when we were with you, so get on with it. We weren't just chilling and expecting you to take care of us. Nah, we worked our fingers to the bone, up half the night moonlighting so we wouldn't be a burden to you. It wasn't because we didn't have a right to your support — we did. We just wanted to set an example of diligence, hoping it would catch on.</w:t>
+              <w:t>Now, here's a direct order from our Lord, Jesus Christ: keep your distance from anyone in the squad who's being lazy and won't work the way we taught you. Don't let them freeload off everyone else. We showed you how to pull your weight when we were with you, so get on with it. We weren't just chilling, expecting everyone else to take care of us. Nah, we worked our fingers to the bone, up half the night moonlighting so we wouldn't be a burden to you. It wasn't because we didn't have a right to your support — we did. We just wanted to set an example of diligence, hoping it would catch on.</w:t>
             </w:r>
           </w:p>
         </w:tc>

</xml_diff>

<commit_message>
2Thessalonians 3차 검수: KO 실루아노→실라(1Thess와 통일), EN our main man→our Master(MSG Master 호칭 복원)
</commit_message>
<xml_diff>
--- a/gdocs_build/2Thessalonians.docx
+++ b/gdocs_build/2Thessalonians.docx
@@ -124,7 +124,7 @@
               <w:rPr>
                 <w:sz w:val="18"/>
               </w:rPr>
-              <w:t>What's up, guys? It's Paul, Silas, and Timothy here, giving a shout-out to our crew in Thessalonica. We're repping God the Father and our main man, Jesus Christ. The Father's the one who hooks you up with everything you need and helps you grow into who you're meant to be.</w:t>
+              <w:t>What's up, guys? It's Paul, Silas, and Timothy here, giving a shout-out to our crew in Thessalonica. We're repping God the Father and our Master, Jesus Christ. The Father's the one who hooks you up with everything you need and helps you grow into who you're meant to be.</w:t>
             </w:r>
           </w:p>
         </w:tc>
@@ -147,7 +147,7 @@
               <w:rPr>
                 <w:sz w:val="18"/>
               </w:rPr>
-              <w:t>다들 잘 지내? 나 바울이야, 실루아노랑 디모데랑 같이 데살로니가에 있는 우리 식구들한테 인사해. 우리는 하나님 아버지랑 우리의 주 예수 그리스도를 따르는 사람들이야. 하나님 아버지가 너희에게 필요한 모든 걸 주시고, 너희가 되어야 할 모습으로 자라게 해 주셔.</w:t>
+              <w:t>다들 잘 지내? 나 바울이야, 실라랑 디모데랑 같이 데살로니가에 있는 우리 식구들한테 인사해. 우리는 하나님 아버지랑 우리의 주 예수 그리스도를 따르는 사람들이야. 하나님 아버지가 너희에게 필요한 모든 걸 주시고, 너희가 되어야 할 모습으로 자라게 해 주셔.</w:t>
             </w:r>
           </w:p>
         </w:tc>

</xml_diff>